<commit_message>
Enlaces del informe al repositorio nuevo
</commit_message>
<xml_diff>
--- a/docs/Informe_Unidad_I.docx
+++ b/docs/Informe_Unidad_I.docx
@@ -15785,7 +15785,7 @@
                   <w:sz w:val="22"/>
                   <w:szCs w:val="22"/>
                 </w:rPr>
-                <w:t>github.com/htacoav/StartUp-MCD</w:t>
+                <w:t>github.com/htacoav/StartUpMCD</w:t>
               </w:r>
             </w:hyperlink>
           </w:p>
@@ -15877,7 +15877,7 @@
                   <w:sz w:val="22"/>
                   <w:szCs w:val="22"/>
                 </w:rPr>
-                <w:t>github.com/htacoav/StartUp-MCD/…/exploracion.ipynb</w:t>
+                <w:t>github.com/htacoav/StartUpMCD/…/exploracion.ipynb</w:t>
               </w:r>
             </w:hyperlink>
           </w:p>
@@ -15987,7 +15987,7 @@
           <w:sz w:val="20"/>
           <w:szCs w:val="20"/>
         </w:rPr>
-        <w:t xml:space="preserve">git clone https://github.com/htacoav/StartUp-MCD.git</w:t>
+        <w:t xml:space="preserve">git clone https://github.com/htacoav/StartUpMCD.git</w:t>
       </w:r>
     </w:p>
     <w:p>
@@ -16001,7 +16001,7 @@
           <w:sz w:val="20"/>
           <w:szCs w:val="20"/>
         </w:rPr>
-        <w:t xml:space="preserve">cd StartUp-MCD</w:t>
+        <w:t xml:space="preserve">cd StartUpMCD</w:t>
       </w:r>
     </w:p>
     <w:p>

</xml_diff>